<commit_message>
Apply final quality-correction pass to EcoSort Campus documentation
- Clarified AI execution pipeline: IBM Granite watsonx.ai integration with deterministic rule-based fallback
- Replaced 'Real AI Classification Result' with 'Verified Prototype Classification Result'
- Updated benchmark test cases section title to 'Prototype Evaluation & Benchmark Test Cases'
- Refined testing methodology statement to 'Prototype verification testing was conducted against the Next.js API endpoint (/api/classify) and client UI form controls'
- Added explicit testing limitation note regarding non-statistical prototype validation
- Labeled 70.2% diversion explicitly as 'Projected / Estimated Impact' and stream percentages as 'Illustrative Stream-Specific Pilot Projections'
- Clarified campus bin alignment as 'aligned with the project's defined campus waste-management categories and operational requirements'
- Updated both PDF and editable DOCX in docs/
</commit_message>
<xml_diff>
--- a/docs/EcoSort_Campus_Prototype_Documentation.docx
+++ b/docs/EcoSort_Campus_Prototype_Documentation.docx
@@ -163,14 +163,19 @@
     </w:p>
     <w:p>
       <w:r>
-        <w:t>EcoSort Campus uses natural language processing (NLP) and zero-shot entity extraction powered by IBM Granite foundation models (watsonx.ai). The solution is implemented cleanly as a full-stack Next.js web application with an App Router API backend (/api/classify).</w:t>
+        <w:t>EcoSort Campus uses natural language processing (NLP) and zero-shot entity extraction designed around IBM Granite foundation models (watsonx.ai). The solution is implemented cleanly as a full-stack Next.js web application with an App Router API backend (/api/classify).</w:t>
         <w:br/>
         <w:br/>
         <w:t>Dual-Engine Reliability Strategy:</w:t>
         <w:br/>
         <w:t>1. Live IBM Granite API: Interacts with ibm/granite-3-3-8b-instruct via watsonx.ai REST endpoints when credentials are provided in .env.local.</w:t>
         <w:br/>
-        <w:t>2. Rule-Based Fallback Engine: Provides deterministic classification across all four campus categories for seamless evaluation, offline demo resilience, and automated testing without exposing broken states.</w:t>
+        <w:t>2. Deterministic Rule-Based Fallback Engine: Provides deterministic classification across all four campus categories for seamless evaluation, offline demo resilience, and automated testing without exposing broken states.</w:t>
+        <w:br/>
+        <w:br/>
+        <w:t>Implementation Note on AI Execution:</w:t>
+        <w:br/>
+        <w:t>The prototype includes IBM Granite watsonx.ai integration, with a deterministic rule-based fallback available for demonstration and offline operation. The documented benchmark results were verified using the available prototype classification pipeline.</w:t>
       </w:r>
     </w:p>
     <w:p>
@@ -182,6 +187,11 @@
           <w:color w:val="14532D"/>
         </w:rPr>
         <w:t>3. Four-Bin Campus Classification System</w:t>
+      </w:r>
+    </w:p>
+    <w:p>
+      <w:r>
+        <w:t>EcoSort Campus categorizes all institutional waste streams into four distinct color-coded receptacles aligned with the project's defined campus waste-management categories and operational requirements:</w:t>
       </w:r>
     </w:p>
     <w:tbl>
@@ -492,7 +502,12 @@
         <w:rPr>
           <w:color w:val="14532D"/>
         </w:rPr>
-        <w:t>4. Test Cases &amp; Verification Matrix (PPT Benchmark)</w:t>
+        <w:t>4. Prototype Evaluation &amp; Benchmark Test Cases</w:t>
+      </w:r>
+    </w:p>
+    <w:p>
+      <w:r>
+        <w:t>Four reference test cases defined in the original project presentation were executed against the working EcoSort Campus prototype to verify classification, bin assignment, and safety guidance.</w:t>
       </w:r>
     </w:p>
     <w:tbl>
@@ -862,7 +877,7 @@
     <w:p>
       <w:r>
         <w:br/>
-        <w:t>Screenshots from the Live Application:</w:t>
+        <w:t>Note: These tests verify prototype behavior against selected reference inputs and do not represent a statistically significant accuracy evaluation or production-scale validation.</w:t>
         <w:br/>
       </w:r>
     </w:p>
@@ -900,6 +915,18 @@
             </a:graphic>
           </wp:inline>
         </w:drawing>
+      </w:r>
+    </w:p>
+    <w:p>
+      <w:pPr>
+        <w:jc w:val="center"/>
+      </w:pPr>
+      <w:r>
+        <w:rPr>
+          <w:i/>
+          <w:sz w:val="16"/>
+        </w:rPr>
+        <w:t>Figure: Verified Prototype Output for '9V dead battery'</w:t>
       </w:r>
     </w:p>
     <w:p>
@@ -985,20 +1012,45 @@
         <w:rPr>
           <w:color w:val="14532D"/>
         </w:rPr>
-        <w:t>6. Projected Impact &amp; Future Roadmap</w:t>
+        <w:t>6. Projected / Estimated Impact &amp; Campus Value</w:t>
       </w:r>
     </w:p>
     <w:p>
       <w:r>
-        <w:t>Projected Impact (Concept Pilot Model):</w:t>
+        <w:t>Projected / Estimated Impact (Concept Pilot Model):</w:t>
         <w:br/>
-        <w:t>"A pilot projection across a 3,000-student university campus indicates an average 70.2% overall diversion of municipal solid waste away from local landfills within 60 days of deployment."</w:t>
-        <w:br/>
-        <w:t>*(Important: This figure represents an estimated model projection from the ideation slide deck, not a measured historical deployment result).*</w:t>
+        <w:t>"A pilot projection across a 3,000-student university campus indicates an estimated 70.2% overall diversion of municipal solid waste away from local landfills within 60 days of deployment."</w:t>
         <w:br/>
         <w:br/>
-        <w:t>Future Enhancements:</w:t>
+        <w:t>Important Note on Methodology:</w:t>
         <w:br/>
+        <w:t>The 70.2% figure represents an estimated model projection synthesized from cafeteria, hostel, and lab waste audits documented in the ideation phase, rather than a final measured production statistic from a physical deployment.</w:t>
+        <w:br/>
+        <w:br/>
+        <w:t>Illustrative Stream-Specific Pilot Projections (3,000-Student Pilot):</w:t>
+        <w:br/>
+        <w:t>• Campus Cafeteria Plastics: 82% Segregated (Projected)</w:t>
+        <w:br/>
+        <w:t>• Hostel Dry Paper &amp; Boxes: 76% Segregated (Projected)</w:t>
+        <w:br/>
+        <w:t>• Mess Food Waste: 68% Composted (Projected)</w:t>
+        <w:br/>
+        <w:t>• Departmental &amp; Lab E-Waste: 55% Segregated (Projected)</w:t>
+        <w:br/>
+        <w:br/>
+        <w:t>Note: These values are conceptual projections from the project ideation phase and have not been validated through a physical campus deployment.</w:t>
+      </w:r>
+    </w:p>
+    <w:p>
+      <w:pPr>
+        <w:pStyle w:val="Heading2"/>
+      </w:pPr>
+      <w:r>
+        <w:t>Future Enhancements (Future Scope)</w:t>
+      </w:r>
+    </w:p>
+    <w:p>
+      <w:r>
         <w:t>• Multimodal Computer Vision (IBM Granite Vision image recognition at bin stations)</w:t>
         <w:br/>
         <w:t>• Multilingual voice and text input (Hindi, Tamil, Telugu)</w:t>

</xml_diff>